<commit_message>
last stats, plos submit
</commit_message>
<xml_diff>
--- a/paper/Journal - PLOS One/Cover Letter.docx
+++ b/paper/Journal - PLOS One/Cover Letter.docx
@@ -5,316 +5,460 @@
     <w:p>
       <w:pPr>
         <w:jc w:val="both"/>
+        <w:rPr>
+          <w:rFonts w:ascii="Times New Roman" w:hAnsi="Times New Roman" w:cs="Times New Roman"/>
+        </w:rPr>
       </w:pPr>
       <w:r>
+        <w:rPr>
+          <w:rFonts w:ascii="Times New Roman" w:hAnsi="Times New Roman" w:cs="Times New Roman"/>
+        </w:rPr>
         <w:t>Dear Editorial Board,</w:t>
       </w:r>
     </w:p>
     <w:p>
       <w:pPr>
         <w:jc w:val="both"/>
+        <w:rPr>
+          <w:rFonts w:ascii="Times New Roman" w:hAnsi="Times New Roman" w:cs="Times New Roman"/>
+        </w:rPr>
       </w:pPr>
     </w:p>
     <w:p>
       <w:pPr>
         <w:jc w:val="both"/>
+        <w:rPr>
+          <w:rFonts w:ascii="Times New Roman" w:hAnsi="Times New Roman" w:cs="Times New Roman"/>
+        </w:rPr>
       </w:pPr>
       <w:r>
+        <w:rPr>
+          <w:rFonts w:ascii="Times New Roman" w:hAnsi="Times New Roman" w:cs="Times New Roman"/>
+        </w:rPr>
         <w:t>We would like to submit our manuscript entitled “</w:t>
       </w:r>
       <w:r>
+        <w:rPr>
+          <w:rFonts w:ascii="Times New Roman" w:hAnsi="Times New Roman" w:cs="Times New Roman"/>
+        </w:rPr>
         <w:t xml:space="preserve">A study of object detection </w:t>
       </w:r>
       <w:r>
+        <w:rPr>
+          <w:rFonts w:ascii="Times New Roman" w:hAnsi="Times New Roman" w:cs="Times New Roman"/>
+        </w:rPr>
         <w:t>in</w:t>
       </w:r>
       <w:r>
+        <w:rPr>
+          <w:rFonts w:ascii="Times New Roman" w:hAnsi="Times New Roman" w:cs="Times New Roman"/>
+        </w:rPr>
         <w:t xml:space="preserve"> histology</w:t>
       </w:r>
       <w:r>
-        <w:t>,</w:t>
-      </w:r>
-      <w:r>
-        <w:rPr>
-          <w:rFonts w:ascii="Aptos" w:hAnsi="Aptos" w:cs="Aptos"/>
-        </w:rPr>
-        <w:t>”</w:t>
-      </w:r>
-      <w:r>
-        <w:t xml:space="preserve"> for consideration</w:t>
-      </w:r>
-      <w:r>
+        <w:rPr>
+          <w:rFonts w:ascii="Times New Roman" w:hAnsi="Times New Roman" w:cs="Times New Roman"/>
+        </w:rPr>
+        <w:t>,” for consideration</w:t>
+      </w:r>
+      <w:r>
+        <w:rPr>
+          <w:rFonts w:ascii="Times New Roman" w:hAnsi="Times New Roman" w:cs="Times New Roman"/>
+        </w:rPr>
         <w:t xml:space="preserve"> in PLOS One</w:t>
       </w:r>
       <w:r>
-        <w:t>. In this work, we provide a comprehensive benchmark of state</w:t>
-      </w:r>
-      <w:r>
-        <w:rPr>
-          <w:rFonts w:ascii="Cambria Math" w:hAnsi="Cambria Math" w:cs="Cambria Math"/>
-        </w:rPr>
-        <w:t>‑</w:t>
-      </w:r>
-      <w:r>
-        <w:t>of</w:t>
-      </w:r>
-      <w:r>
-        <w:rPr>
-          <w:rFonts w:ascii="Cambria Math" w:hAnsi="Cambria Math" w:cs="Cambria Math"/>
-        </w:rPr>
-        <w:t>‑</w:t>
-      </w:r>
-      <w:r>
-        <w:t>the</w:t>
-      </w:r>
-      <w:r>
-        <w:rPr>
-          <w:rFonts w:ascii="Cambria Math" w:hAnsi="Cambria Math" w:cs="Cambria Math"/>
-        </w:rPr>
-        <w:t>‑</w:t>
-      </w:r>
-      <w:r>
-        <w:t>art object detection models (YOLOv8</w:t>
-      </w:r>
-      <w:r>
-        <w:rPr>
-          <w:rFonts w:ascii="Aptos" w:hAnsi="Aptos" w:cs="Aptos"/>
-        </w:rPr>
-        <w:t>–</w:t>
-      </w:r>
-      <w:r>
-        <w:t>v12, YOLO</w:t>
-      </w:r>
-      <w:r>
-        <w:rPr>
-          <w:rFonts w:ascii="Cambria Math" w:hAnsi="Cambria Math" w:cs="Cambria Math"/>
-        </w:rPr>
-        <w:t>‑</w:t>
-      </w:r>
-      <w:r>
-        <w:t>World, YOLOE, RT</w:t>
-      </w:r>
-      <w:r>
-        <w:rPr>
-          <w:rFonts w:ascii="Cambria Math" w:hAnsi="Cambria Math" w:cs="Cambria Math"/>
-        </w:rPr>
-        <w:t>‑</w:t>
-      </w:r>
-      <w:r>
-        <w:t xml:space="preserve">DETR) on </w:t>
-      </w:r>
-      <w:r>
-        <w:t>five</w:t>
-      </w:r>
-      <w:r>
-        <w:t xml:space="preserve"> complementary </w:t>
-      </w:r>
-      <w:r>
-        <w:t>histology</w:t>
-      </w:r>
-      <w:r>
-        <w:t xml:space="preserve"> datasets. Our findings demonstrate that </w:t>
-      </w:r>
-      <w:r>
-        <w:t xml:space="preserve">several models YOLOv11, YOLOv12 and </w:t>
-      </w:r>
-      <w:r>
-        <w:t>YOLOE</w:t>
-      </w:r>
-      <w:r>
-        <w:t xml:space="preserve"> ha</w:t>
-      </w:r>
-      <w:r>
-        <w:t xml:space="preserve">ve </w:t>
-      </w:r>
-      <w:r>
-        <w:t>strong performance</w:t>
-      </w:r>
-      <w:r>
-        <w:t xml:space="preserve"> across </w:t>
-      </w:r>
-      <w:r>
-        <w:t>the</w:t>
-      </w:r>
-      <w:r>
-        <w:t xml:space="preserve"> datasets—particularly for </w:t>
-      </w:r>
-      <w:r>
-        <w:t xml:space="preserve">the </w:t>
-      </w:r>
-      <w:r>
-        <w:t>small</w:t>
-      </w:r>
-      <w:r>
-        <w:t>er</w:t>
-      </w:r>
-      <w:r>
-        <w:rPr>
-          <w:rFonts w:ascii="Cambria Math" w:hAnsi="Cambria Math" w:cs="Cambria Math"/>
-        </w:rPr>
-        <w:t>‑</w:t>
-      </w:r>
-      <w:r>
-        <w:t>area pathologies</w:t>
-      </w:r>
-      <w:r>
-        <w:rPr>
-          <w:rFonts w:ascii="Aptos" w:hAnsi="Aptos" w:cs="Aptos"/>
-        </w:rPr>
-        <w:t>—</w:t>
-      </w:r>
-      <w:r>
-        <w:t xml:space="preserve">highlighting the promise of </w:t>
-      </w:r>
-      <w:r>
-        <w:t xml:space="preserve">integrating automated </w:t>
-      </w:r>
-      <w:r>
-        <w:t>detection in clinical settings</w:t>
-      </w:r>
-      <w:r>
-        <w:t xml:space="preserve">; moreover, </w:t>
-      </w:r>
-      <w:r>
-        <w:t>YOLOv1</w:t>
-      </w:r>
-      <w:r>
-        <w:t xml:space="preserve">1 </w:t>
-      </w:r>
-      <w:r>
-        <w:t>delivers an excellent balance of detection accuracy and computational efficiency.</w:t>
+        <w:rPr>
+          <w:rFonts w:ascii="Times New Roman" w:hAnsi="Times New Roman" w:cs="Times New Roman"/>
+        </w:rPr>
+        <w:t xml:space="preserve">. </w:t>
+      </w:r>
+      <w:r>
+        <w:rPr>
+          <w:rFonts w:ascii="Times New Roman" w:hAnsi="Times New Roman" w:cs="Times New Roman"/>
+        </w:rPr>
+        <w:t>Manual analysis of the increasingly large and complex histology data is quickly becoming infeasible in routine practice. By rigorously comparing modern object detection and transformer‑based approaches, our study not only situates these results within the rapidly evolving literature but also addresses a gap in automated histology analysis. These insights will guide the development of AI‑assisted tools to support clinicians in the detection of pathologies.</w:t>
       </w:r>
     </w:p>
     <w:p>
       <w:pPr>
         <w:jc w:val="both"/>
+        <w:rPr>
+          <w:rFonts w:ascii="Times New Roman" w:hAnsi="Times New Roman" w:cs="Times New Roman"/>
+        </w:rPr>
       </w:pPr>
       <w:r>
-        <w:t xml:space="preserve">Manual analysis of the increasingly large and complex </w:t>
-      </w:r>
-      <w:r>
+        <w:rPr>
+          <w:rFonts w:ascii="Times New Roman" w:hAnsi="Times New Roman" w:cs="Times New Roman"/>
+        </w:rPr>
+        <w:t xml:space="preserve">In this work, we provide a comprehensive benchmark of state‑of‑the‑art object detection models (YOLOv8–v12, YOLO‑World, YOLOE, RT‑DETR) on </w:t>
+      </w:r>
+      <w:r>
+        <w:rPr>
+          <w:rFonts w:ascii="Times New Roman" w:hAnsi="Times New Roman" w:cs="Times New Roman"/>
+        </w:rPr>
+        <w:t>five</w:t>
+      </w:r>
+      <w:r>
+        <w:rPr>
+          <w:rFonts w:ascii="Times New Roman" w:hAnsi="Times New Roman" w:cs="Times New Roman"/>
+        </w:rPr>
+        <w:t xml:space="preserve"> complementary </w:t>
+      </w:r>
+      <w:r>
+        <w:rPr>
+          <w:rFonts w:ascii="Times New Roman" w:hAnsi="Times New Roman" w:cs="Times New Roman"/>
+        </w:rPr>
         <w:t>histology</w:t>
       </w:r>
       <w:r>
-        <w:t xml:space="preserve"> data is quickly becoming infeasible in routine practice. By rigorously comparing modern object detection and transformer</w:t>
-      </w:r>
-      <w:r>
-        <w:rPr>
-          <w:rFonts w:ascii="Cambria Math" w:hAnsi="Cambria Math" w:cs="Cambria Math"/>
-        </w:rPr>
-        <w:t>‑</w:t>
-      </w:r>
-      <w:r>
-        <w:t xml:space="preserve">based approaches, our study not only situates these results within the rapidly evolving literature but also addresses a gap in automated </w:t>
-      </w:r>
-      <w:r>
-        <w:t>histology</w:t>
-      </w:r>
-      <w:r>
-        <w:t xml:space="preserve"> analysis. These insights will guide the development of AI</w:t>
-      </w:r>
-      <w:r>
-        <w:rPr>
-          <w:rFonts w:ascii="Cambria Math" w:hAnsi="Cambria Math" w:cs="Cambria Math"/>
-        </w:rPr>
-        <w:t>‑</w:t>
-      </w:r>
-      <w:r>
-        <w:t xml:space="preserve">assisted tools to support clinicians in </w:t>
-      </w:r>
-      <w:r>
+        <w:rPr>
+          <w:rFonts w:ascii="Times New Roman" w:hAnsi="Times New Roman" w:cs="Times New Roman"/>
+        </w:rPr>
+        <w:t xml:space="preserve"> datasets. Our findings demonstrate that </w:t>
+      </w:r>
+      <w:r>
+        <w:rPr>
+          <w:rFonts w:ascii="Times New Roman" w:hAnsi="Times New Roman" w:cs="Times New Roman"/>
+        </w:rPr>
+        <w:t xml:space="preserve">several models YOLOv11, YOLOv12 and </w:t>
+      </w:r>
+      <w:r>
+        <w:rPr>
+          <w:rFonts w:ascii="Times New Roman" w:hAnsi="Times New Roman" w:cs="Times New Roman"/>
+        </w:rPr>
+        <w:t>YOLOE</w:t>
+      </w:r>
+      <w:r>
+        <w:rPr>
+          <w:rFonts w:ascii="Times New Roman" w:hAnsi="Times New Roman" w:cs="Times New Roman"/>
+        </w:rPr>
+        <w:t xml:space="preserve"> ha</w:t>
+      </w:r>
+      <w:r>
+        <w:rPr>
+          <w:rFonts w:ascii="Times New Roman" w:hAnsi="Times New Roman" w:cs="Times New Roman"/>
+        </w:rPr>
+        <w:t xml:space="preserve">ve </w:t>
+      </w:r>
+      <w:r>
+        <w:rPr>
+          <w:rFonts w:ascii="Times New Roman" w:hAnsi="Times New Roman" w:cs="Times New Roman"/>
+        </w:rPr>
+        <w:t>strong performance</w:t>
+      </w:r>
+      <w:r>
+        <w:rPr>
+          <w:rFonts w:ascii="Times New Roman" w:hAnsi="Times New Roman" w:cs="Times New Roman"/>
+        </w:rPr>
+        <w:t xml:space="preserve"> across </w:t>
+      </w:r>
+      <w:r>
+        <w:rPr>
+          <w:rFonts w:ascii="Times New Roman" w:hAnsi="Times New Roman" w:cs="Times New Roman"/>
+        </w:rPr>
+        <w:t>the</w:t>
+      </w:r>
+      <w:r>
+        <w:rPr>
+          <w:rFonts w:ascii="Times New Roman" w:hAnsi="Times New Roman" w:cs="Times New Roman"/>
+        </w:rPr>
+        <w:t xml:space="preserve"> datasets—particularly for </w:t>
+      </w:r>
+      <w:r>
+        <w:rPr>
+          <w:rFonts w:ascii="Times New Roman" w:hAnsi="Times New Roman" w:cs="Times New Roman"/>
+        </w:rPr>
         <w:t xml:space="preserve">the </w:t>
       </w:r>
       <w:r>
-        <w:t>detection</w:t>
-      </w:r>
-      <w:r>
-        <w:t xml:space="preserve"> of pathologies</w:t>
-      </w:r>
-      <w:r>
-        <w:t>.</w:t>
+        <w:rPr>
+          <w:rFonts w:ascii="Times New Roman" w:hAnsi="Times New Roman" w:cs="Times New Roman"/>
+        </w:rPr>
+        <w:t>small</w:t>
+      </w:r>
+      <w:r>
+        <w:rPr>
+          <w:rFonts w:ascii="Times New Roman" w:hAnsi="Times New Roman" w:cs="Times New Roman"/>
+        </w:rPr>
+        <w:t>er</w:t>
+      </w:r>
+      <w:r>
+        <w:rPr>
+          <w:rFonts w:ascii="Times New Roman" w:hAnsi="Times New Roman" w:cs="Times New Roman"/>
+        </w:rPr>
+        <w:t xml:space="preserve">‑area pathologies—highlighting the promise of </w:t>
+      </w:r>
+      <w:r>
+        <w:rPr>
+          <w:rFonts w:ascii="Times New Roman" w:hAnsi="Times New Roman" w:cs="Times New Roman"/>
+        </w:rPr>
+        <w:t xml:space="preserve">integrating automated </w:t>
+      </w:r>
+      <w:r>
+        <w:rPr>
+          <w:rFonts w:ascii="Times New Roman" w:hAnsi="Times New Roman" w:cs="Times New Roman"/>
+        </w:rPr>
+        <w:t>detection in clinical settings</w:t>
+      </w:r>
+      <w:r>
+        <w:rPr>
+          <w:rFonts w:ascii="Times New Roman" w:hAnsi="Times New Roman" w:cs="Times New Roman"/>
+        </w:rPr>
+        <w:t xml:space="preserve">; moreover, </w:t>
+      </w:r>
+      <w:r>
+        <w:rPr>
+          <w:rFonts w:ascii="Times New Roman" w:hAnsi="Times New Roman" w:cs="Times New Roman"/>
+        </w:rPr>
+        <w:t>YOLOv1</w:t>
+      </w:r>
+      <w:r>
+        <w:rPr>
+          <w:rFonts w:ascii="Times New Roman" w:hAnsi="Times New Roman" w:cs="Times New Roman"/>
+        </w:rPr>
+        <w:t xml:space="preserve">1 </w:t>
+      </w:r>
+      <w:r>
+        <w:rPr>
+          <w:rFonts w:ascii="Times New Roman" w:hAnsi="Times New Roman" w:cs="Times New Roman"/>
+        </w:rPr>
+        <w:t>delivers an excellent balance of detection accuracy and computational efficiency</w:t>
+      </w:r>
+      <w:r>
+        <w:rPr>
+          <w:rFonts w:ascii="Times New Roman" w:hAnsi="Times New Roman" w:cs="Times New Roman"/>
+        </w:rPr>
+        <w:t xml:space="preserve"> confirmed by statistical evaluations.</w:t>
+      </w:r>
+      <w:r>
+        <w:rPr>
+          <w:rFonts w:ascii="Times New Roman" w:hAnsi="Times New Roman" w:cs="Times New Roman"/>
+        </w:rPr>
+        <w:t xml:space="preserve"> Our statistical evaluations also </w:t>
+      </w:r>
+      <w:r>
+        <w:rPr>
+          <w:rFonts w:ascii="Times New Roman" w:hAnsi="Times New Roman" w:cs="Times New Roman"/>
+        </w:rPr>
+        <w:t>confirm</w:t>
+      </w:r>
+      <w:r>
+        <w:rPr>
+          <w:rFonts w:ascii="Times New Roman" w:hAnsi="Times New Roman" w:cs="Times New Roman"/>
+        </w:rPr>
+        <w:t xml:space="preserve"> that object detection models are not yet performant enough in the detection of small sized objects; thus, offering an insight to their applicability depending on the characteristics of a specific domain.</w:t>
       </w:r>
     </w:p>
     <w:p>
       <w:pPr>
         <w:jc w:val="both"/>
+        <w:rPr>
+          <w:rFonts w:ascii="Times New Roman" w:hAnsi="Times New Roman" w:cs="Times New Roman"/>
+        </w:rPr>
       </w:pPr>
       <w:r>
-        <w:t xml:space="preserve">We confirm that neither the manuscript nor any parts of its content are currently under consideration for publication with or published in another journal and that all authors have approved the manuscript and agree with its submission </w:t>
-      </w:r>
-      <w:r>
-        <w:t>to PLOS One.</w:t>
+        <w:rPr>
+          <w:rFonts w:ascii="Times New Roman" w:hAnsi="Times New Roman" w:cs="Times New Roman"/>
+        </w:rPr>
+        <w:t>Moreover, we discuss the limitations of fixed global thresholds on confidence values for test-time inference and propose a new graph-based approach that</w:t>
+      </w:r>
+      <w:r>
+        <w:rPr>
+          <w:rFonts w:ascii="Times New Roman" w:hAnsi="Times New Roman" w:cs="Times New Roman"/>
+        </w:rPr>
+        <w:t xml:space="preserve"> requires no additional labelled data. </w:t>
+      </w:r>
+      <w:r>
+        <w:rPr>
+          <w:rFonts w:ascii="Times New Roman" w:hAnsi="Times New Roman" w:cs="Times New Roman"/>
+        </w:rPr>
+        <w:t>The proposed approach</w:t>
+      </w:r>
+      <w:r>
+        <w:rPr>
+          <w:rFonts w:ascii="Times New Roman" w:hAnsi="Times New Roman" w:cs="Times New Roman"/>
+        </w:rPr>
+        <w:t xml:space="preserve"> was evaluated across multiple datasets and models providing higher performance than fixed and automated thresholds. </w:t>
+      </w:r>
+      <w:r>
+        <w:rPr>
+          <w:rFonts w:ascii="Times New Roman" w:hAnsi="Times New Roman" w:cs="Times New Roman"/>
+        </w:rPr>
+        <w:t xml:space="preserve">Our approach will help experts in </w:t>
+      </w:r>
+      <w:r>
+        <w:rPr>
+          <w:rFonts w:ascii="Times New Roman" w:hAnsi="Times New Roman" w:cs="Times New Roman"/>
+        </w:rPr>
+        <w:t>identifying</w:t>
+      </w:r>
+      <w:r>
+        <w:rPr>
+          <w:rFonts w:ascii="Times New Roman" w:hAnsi="Times New Roman" w:cs="Times New Roman"/>
+        </w:rPr>
+        <w:t xml:space="preserve"> </w:t>
+      </w:r>
+      <w:r>
+        <w:rPr>
+          <w:rFonts w:ascii="Times New Roman" w:hAnsi="Times New Roman" w:cs="Times New Roman"/>
+        </w:rPr>
+        <w:t>valid</w:t>
+      </w:r>
+      <w:r>
+        <w:rPr>
+          <w:rFonts w:ascii="Times New Roman" w:hAnsi="Times New Roman" w:cs="Times New Roman"/>
+        </w:rPr>
+        <w:t xml:space="preserve"> detections </w:t>
+      </w:r>
+      <w:r>
+        <w:rPr>
+          <w:rFonts w:ascii="Times New Roman" w:hAnsi="Times New Roman" w:cs="Times New Roman"/>
+        </w:rPr>
+        <w:t xml:space="preserve">with </w:t>
+      </w:r>
+      <w:r>
+        <w:rPr>
+          <w:rFonts w:ascii="Times New Roman" w:hAnsi="Times New Roman" w:cs="Times New Roman"/>
+        </w:rPr>
+        <w:t>higher</w:t>
+      </w:r>
+      <w:r>
+        <w:rPr>
+          <w:rFonts w:ascii="Times New Roman" w:hAnsi="Times New Roman" w:cs="Times New Roman"/>
+        </w:rPr>
+        <w:t xml:space="preserve"> precision</w:t>
+      </w:r>
+      <w:r>
+        <w:rPr>
+          <w:rFonts w:ascii="Times New Roman" w:hAnsi="Times New Roman" w:cs="Times New Roman"/>
+        </w:rPr>
+        <w:t xml:space="preserve"> when employing </w:t>
+      </w:r>
+      <w:r>
+        <w:rPr>
+          <w:rFonts w:ascii="Times New Roman" w:hAnsi="Times New Roman" w:cs="Times New Roman"/>
+        </w:rPr>
+        <w:t xml:space="preserve">object detection </w:t>
+      </w:r>
+      <w:r>
+        <w:rPr>
+          <w:rFonts w:ascii="Times New Roman" w:hAnsi="Times New Roman" w:cs="Times New Roman"/>
+        </w:rPr>
+        <w:t>models in real world scenarios.</w:t>
       </w:r>
     </w:p>
     <w:p>
       <w:pPr>
         <w:jc w:val="both"/>
+        <w:rPr>
+          <w:rFonts w:ascii="Times New Roman" w:hAnsi="Times New Roman" w:cs="Times New Roman"/>
+        </w:rPr>
       </w:pPr>
       <w:r>
-        <w:t>Thank you for considering our work. We look forward to your feedback.</w:t>
+        <w:rPr>
+          <w:rFonts w:ascii="Times New Roman" w:hAnsi="Times New Roman" w:cs="Times New Roman"/>
+        </w:rPr>
+        <w:t xml:space="preserve">We confirm that neither the manuscript nor any parts of its content are currently under consideration for publication with or published in another journal and that all authors have approved the manuscript and agree with its submission </w:t>
+      </w:r>
+      <w:r>
+        <w:rPr>
+          <w:rFonts w:ascii="Times New Roman" w:hAnsi="Times New Roman" w:cs="Times New Roman"/>
+        </w:rPr>
+        <w:t>to PLOS One.</w:t>
       </w:r>
     </w:p>
     <w:p>
       <w:pPr>
         <w:jc w:val="both"/>
+        <w:rPr>
+          <w:rFonts w:ascii="Times New Roman" w:hAnsi="Times New Roman" w:cs="Times New Roman"/>
+        </w:rPr>
+      </w:pPr>
+      <w:r>
+        <w:rPr>
+          <w:rFonts w:ascii="Times New Roman" w:hAnsi="Times New Roman" w:cs="Times New Roman"/>
+        </w:rPr>
+        <w:t>Thank you for considering our work. We look forward to your feedback.</w:t>
+      </w:r>
+    </w:p>
+    <w:p>
+      <w:pPr>
+        <w:jc w:val="both"/>
+        <w:rPr>
+          <w:rFonts w:ascii="Times New Roman" w:hAnsi="Times New Roman" w:cs="Times New Roman"/>
+        </w:rPr>
       </w:pPr>
     </w:p>
     <w:p>
       <w:pPr>
         <w:jc w:val="both"/>
+        <w:rPr>
+          <w:rFonts w:ascii="Times New Roman" w:hAnsi="Times New Roman" w:cs="Times New Roman"/>
+        </w:rPr>
       </w:pPr>
       <w:r>
+        <w:rPr>
+          <w:rFonts w:ascii="Times New Roman" w:hAnsi="Times New Roman" w:cs="Times New Roman"/>
+        </w:rPr>
         <w:t>Sincerely,</w:t>
       </w:r>
     </w:p>
     <w:p>
       <w:pPr>
         <w:jc w:val="both"/>
+        <w:rPr>
+          <w:rFonts w:ascii="Times New Roman" w:hAnsi="Times New Roman" w:cs="Times New Roman"/>
+        </w:rPr>
       </w:pPr>
       <w:r>
+        <w:rPr>
+          <w:rFonts w:ascii="Times New Roman" w:hAnsi="Times New Roman" w:cs="Times New Roman"/>
+        </w:rPr>
         <w:t>Dragoș-Vasile Leordean,</w:t>
       </w:r>
     </w:p>
     <w:p>
       <w:pPr>
         <w:jc w:val="both"/>
+        <w:rPr>
+          <w:rFonts w:ascii="Times New Roman" w:hAnsi="Times New Roman" w:cs="Times New Roman"/>
+        </w:rPr>
       </w:pPr>
       <w:r>
+        <w:rPr>
+          <w:rFonts w:ascii="Times New Roman" w:hAnsi="Times New Roman" w:cs="Times New Roman"/>
+        </w:rPr>
         <w:t>Eugen-Richard Ardelean*</w:t>
       </w:r>
     </w:p>
     <w:p>
       <w:pPr>
         <w:jc w:val="both"/>
+        <w:rPr>
+          <w:rFonts w:ascii="Times New Roman" w:hAnsi="Times New Roman" w:cs="Times New Roman"/>
+        </w:rPr>
       </w:pPr>
       <w:r>
+        <w:rPr>
+          <w:rFonts w:ascii="Times New Roman" w:hAnsi="Times New Roman" w:cs="Times New Roman"/>
+        </w:rPr>
         <w:t>*Corresponding author: ardeleaneugenrichard@gmail.com</w:t>
       </w:r>
     </w:p>
     <w:p>
       <w:pPr>
         <w:jc w:val="both"/>
+        <w:rPr>
+          <w:rFonts w:ascii="Times New Roman" w:hAnsi="Times New Roman" w:cs="Times New Roman"/>
+        </w:rPr>
       </w:pPr>
       <w:r>
-        <w:t>Affiliation: Computer Science Department, Technical University of Cluj</w:t>
-      </w:r>
-      <w:r>
-        <w:rPr>
-          <w:rFonts w:ascii="Cambria Math" w:hAnsi="Cambria Math" w:cs="Cambria Math"/>
-        </w:rPr>
-        <w:t>‑</w:t>
-      </w:r>
-      <w:r>
-        <w:t>Napoca, 400114 Cluj</w:t>
-      </w:r>
-      <w:r>
-        <w:rPr>
-          <w:rFonts w:ascii="Cambria Math" w:hAnsi="Cambria Math" w:cs="Cambria Math"/>
-        </w:rPr>
-        <w:t>‑</w:t>
-      </w:r>
-      <w:r>
-        <w:t>Napoca, Romania</w:t>
+        <w:rPr>
+          <w:rFonts w:ascii="Times New Roman" w:hAnsi="Times New Roman" w:cs="Times New Roman"/>
+        </w:rPr>
+        <w:lastRenderedPageBreak/>
+        <w:t>Affiliation: Computer Science Department, Technical University of Cluj‑Napoca, 400114 Cluj‑Napoca, Romania</w:t>
       </w:r>
     </w:p>
     <w:sectPr>

</xml_diff>